<commit_message>
A few more changes to cheat sheet.
</commit_message>
<xml_diff>
--- a/docs/gitNotes/CheatSheet.docx
+++ b/docs/gitNotes/CheatSheet.docx
@@ -7195,7 +7195,30 @@
         </w:rPr>
         <w:t xml:space="preserve"> </w:t>
       </w:r>
-      <w:bookmarkStart w:id="7" w:name="__DdeLink__1559_2032840482"/>
+      <w:r>
+        <w:rPr>
+          <w:b w:val="false"/>
+          <w:bCs w:val="false"/>
+          <w:color w:val="00000A"/>
+        </w:rPr>
+        <w:t>add upstream (tracking) reference to local config</w:t>
+      </w:r>
+    </w:p>
+    <w:p>
+      <w:pPr>
+        <w:pStyle w:val="PreformattedText"/>
+        <w:ind w:left="709" w:right="0" w:hanging="0"/>
+        <w:rPr/>
+      </w:pPr>
+      <w:bookmarkStart w:id="7" w:name="__DdeLink__1560_2032840482"/>
+      <w:r>
+        <w:rPr>
+          <w:b w:val="false"/>
+          <w:bCs w:val="false"/>
+          <w:color w:val="00000A"/>
+        </w:rPr>
+        <w:t>g</w:t>
+      </w:r>
       <w:bookmarkEnd w:id="7"/>
       <w:r>
         <w:rPr>
@@ -7203,30 +7226,7 @@
           <w:bCs w:val="false"/>
           <w:color w:val="00000A"/>
         </w:rPr>
-        <w:t>add upstream (tracking) reference to local config</w:t>
-      </w:r>
-    </w:p>
-    <w:p>
-      <w:pPr>
-        <w:pStyle w:val="PreformattedText"/>
-        <w:ind w:left="709" w:right="0" w:hanging="0"/>
-        <w:rPr/>
-      </w:pPr>
-      <w:r>
-        <w:rPr>
-          <w:b w:val="false"/>
-          <w:bCs w:val="false"/>
-          <w:color w:val="00000A"/>
-        </w:rPr>
-        <w:t>g</w:t>
-      </w:r>
-      <w:r>
-        <w:rPr>
-          <w:b w:val="false"/>
-          <w:bCs w:val="false"/>
-          <w:color w:val="00000A"/>
-        </w:rPr>
-        <w:t>it branch -v -r | grep Test1</w:t>
+        <w:t>it branch -v -v | grep Test1</w:t>
         <w:tab/>
         <w:tab/>
         <w:t># note that remote tracking branch and upstream config were created</w:t>
@@ -7596,6 +7596,24 @@
       <w:pPr>
         <w:pStyle w:val="PreformattedText"/>
         <w:ind w:left="709" w:right="0" w:hanging="0"/>
+        <w:rPr/>
+      </w:pPr>
+      <w:r>
+        <w:rPr>
+          <w:b w:val="false"/>
+          <w:bCs w:val="false"/>
+          <w:color w:val="00000A"/>
+        </w:rPr>
+        <w:t>git branch -v -v | grep Test1</w:t>
+        <w:tab/>
+        <w:tab/>
+        <w:t># note that remote tracking branch and upstream config were created</w:t>
+      </w:r>
+    </w:p>
+    <w:p>
+      <w:pPr>
+        <w:pStyle w:val="PreformattedText"/>
+        <w:ind w:left="709" w:right="0" w:hanging="0"/>
         <w:rPr>
           <w:b w:val="false"/>
           <w:b w:val="false"/>
@@ -7614,12 +7632,7 @@
       <w:pPr>
         <w:pStyle w:val="PreformattedText"/>
         <w:ind w:left="0" w:right="0" w:hanging="0"/>
-        <w:rPr>
-          <w:b w:val="false"/>
-          <w:b w:val="false"/>
-          <w:bCs w:val="false"/>
-          <w:color w:val="00000A"/>
-        </w:rPr>
+        <w:rPr/>
       </w:pPr>
       <w:r>
         <w:rPr>

</xml_diff>